<commit_message>
Changed code blocks to function, added truncation module
</commit_message>
<xml_diff>
--- a/docassemble/NoticeOfDeathAffidavit/data/templates/notice_of_death_affidavit.docx
+++ b/docassemble/NoticeOfDeathAffidavit/data/templates/notice_of_death_affidavit.docx
@@ -589,7 +589,6 @@
               </w:rPr>
               <w:t>{{</w:t>
             </w:r>
-            <w:proofErr w:type="spellStart"/>
             <w:r>
               <w:rPr>
                 <w:rFonts w:ascii="Verdana" w:hAnsi="Verdana"/>
@@ -604,34 +603,7 @@
                 <w:sz w:val="24"/>
                 <w:szCs w:val="24"/>
               </w:rPr>
-              <w:t>.name_</w:t>
-            </w:r>
-            <w:proofErr w:type="gramStart"/>
-            <w:r>
-              <w:rPr>
-                <w:rFonts w:ascii="Verdana" w:hAnsi="Verdana"/>
-                <w:sz w:val="24"/>
-                <w:szCs w:val="24"/>
-              </w:rPr>
-              <w:t>full</w:t>
-            </w:r>
-            <w:proofErr w:type="spellEnd"/>
-            <w:r>
-              <w:rPr>
-                <w:rFonts w:ascii="Verdana" w:hAnsi="Verdana"/>
-                <w:sz w:val="24"/>
-                <w:szCs w:val="24"/>
-              </w:rPr>
-              <w:t>(</w:t>
-            </w:r>
-            <w:proofErr w:type="gramEnd"/>
-            <w:r>
-              <w:rPr>
-                <w:rFonts w:ascii="Verdana" w:hAnsi="Verdana"/>
-                <w:sz w:val="24"/>
-                <w:szCs w:val="24"/>
-              </w:rPr>
-              <w:t>)}}</w:t>
+              <w:t>.name_full()}}</w:t>
             </w:r>
           </w:p>
         </w:tc>
@@ -688,7 +660,6 @@
                 <w:szCs w:val="24"/>
               </w:rPr>
             </w:pPr>
-            <w:proofErr w:type="gramStart"/>
             <w:r>
               <w:rPr>
                 <w:rFonts w:ascii="Verdana" w:hAnsi="Verdana"/>
@@ -703,52 +674,15 @@
                 <w:sz w:val="24"/>
                 <w:szCs w:val="24"/>
               </w:rPr>
-              <w:t xml:space="preserve"> </w:t>
+              <w:t xml:space="preserve"> taxpayer</w:t>
             </w:r>
-            <w:proofErr w:type="spellStart"/>
             <w:r>
               <w:rPr>
                 <w:rFonts w:ascii="Verdana" w:hAnsi="Verdana"/>
                 <w:sz w:val="24"/>
                 <w:szCs w:val="24"/>
               </w:rPr>
-              <w:t>taxpayer</w:t>
-            </w:r>
-            <w:proofErr w:type="gramEnd"/>
-            <w:r>
-              <w:rPr>
-                <w:rFonts w:ascii="Verdana" w:hAnsi="Verdana"/>
-                <w:sz w:val="24"/>
-                <w:szCs w:val="24"/>
-              </w:rPr>
-              <w:t>.</w:t>
-            </w:r>
-            <w:proofErr w:type="gramStart"/>
-            <w:r>
-              <w:rPr>
-                <w:rFonts w:ascii="Verdana" w:hAnsi="Verdana"/>
-                <w:sz w:val="24"/>
-                <w:szCs w:val="24"/>
-              </w:rPr>
-              <w:t>address.line</w:t>
-            </w:r>
-            <w:proofErr w:type="gramEnd"/>
-            <w:r>
-              <w:rPr>
-                <w:rFonts w:ascii="Verdana" w:hAnsi="Verdana"/>
-                <w:sz w:val="24"/>
-                <w:szCs w:val="24"/>
-              </w:rPr>
-              <w:t>_one</w:t>
-            </w:r>
-            <w:proofErr w:type="spellEnd"/>
-            <w:r>
-              <w:rPr>
-                <w:rFonts w:ascii="Verdana" w:hAnsi="Verdana"/>
-                <w:sz w:val="24"/>
-                <w:szCs w:val="24"/>
-              </w:rPr>
-              <w:t>(bare=True)}}</w:t>
+              <w:t>.address.line_one(bare=True)}}</w:t>
             </w:r>
           </w:p>
         </w:tc>
@@ -805,7 +739,6 @@
                 <w:szCs w:val="24"/>
               </w:rPr>
             </w:pPr>
-            <w:proofErr w:type="gramStart"/>
             <w:r>
               <w:rPr>
                 <w:rFonts w:ascii="Verdana" w:hAnsi="Verdana"/>
@@ -814,7 +747,6 @@
               </w:rPr>
               <w:t xml:space="preserve">{{ </w:t>
             </w:r>
-            <w:proofErr w:type="spellStart"/>
             <w:r>
               <w:rPr>
                 <w:rFonts w:ascii="Verdana" w:hAnsi="Verdana"/>
@@ -823,59 +755,13 @@
               </w:rPr>
               <w:t>taxpayer</w:t>
             </w:r>
-            <w:proofErr w:type="gramEnd"/>
             <w:r>
               <w:rPr>
                 <w:rFonts w:ascii="Verdana" w:hAnsi="Verdana"/>
                 <w:sz w:val="24"/>
                 <w:szCs w:val="24"/>
               </w:rPr>
-              <w:t>.</w:t>
-            </w:r>
-            <w:proofErr w:type="gramStart"/>
-            <w:r>
-              <w:rPr>
-                <w:rFonts w:ascii="Verdana" w:hAnsi="Verdana"/>
-                <w:sz w:val="24"/>
-                <w:szCs w:val="24"/>
-              </w:rPr>
-              <w:t>address.line</w:t>
-            </w:r>
-            <w:proofErr w:type="gramEnd"/>
-            <w:r>
-              <w:rPr>
-                <w:rFonts w:ascii="Verdana" w:hAnsi="Verdana"/>
-                <w:sz w:val="24"/>
-                <w:szCs w:val="24"/>
-              </w:rPr>
-              <w:t>_</w:t>
-            </w:r>
-            <w:proofErr w:type="gramStart"/>
-            <w:r>
-              <w:rPr>
-                <w:rFonts w:ascii="Verdana" w:hAnsi="Verdana"/>
-                <w:sz w:val="24"/>
-                <w:szCs w:val="24"/>
-              </w:rPr>
-              <w:t>two</w:t>
-            </w:r>
-            <w:proofErr w:type="spellEnd"/>
-            <w:r>
-              <w:rPr>
-                <w:rFonts w:ascii="Verdana" w:hAnsi="Verdana"/>
-                <w:sz w:val="24"/>
-                <w:szCs w:val="24"/>
-              </w:rPr>
-              <w:t>(</w:t>
-            </w:r>
-            <w:proofErr w:type="gramEnd"/>
-            <w:r>
-              <w:rPr>
-                <w:rFonts w:ascii="Verdana" w:hAnsi="Verdana"/>
-                <w:sz w:val="24"/>
-                <w:szCs w:val="24"/>
-              </w:rPr>
-              <w:t>)}}</w:t>
+              <w:t>.address.line_two()}}</w:t>
             </w:r>
           </w:p>
         </w:tc>
@@ -986,7 +872,6 @@
         </w:rPr>
         <w:t>{{</w:t>
       </w:r>
-      <w:proofErr w:type="spellStart"/>
       <w:r>
         <w:rPr>
           <w:rFonts w:ascii="Verdana" w:hAnsi="Verdana"/>
@@ -999,38 +884,21 @@
           <w:rFonts w:ascii="Verdana" w:hAnsi="Verdana"/>
           <w:bCs/>
         </w:rPr>
-        <w:t>.name_full</w:t>
-      </w:r>
-      <w:proofErr w:type="spellEnd"/>
+        <w:t>.name_full()}} ({{</w:t>
+      </w:r>
       <w:r>
         <w:rPr>
           <w:rFonts w:ascii="Verdana" w:hAnsi="Verdana"/>
           <w:bCs/>
         </w:rPr>
-        <w:t>()}} ({{</w:t>
-      </w:r>
-      <w:proofErr w:type="spellStart"/>
+        <w:t>owner</w:t>
+      </w:r>
       <w:r>
         <w:rPr>
           <w:rFonts w:ascii="Verdana" w:hAnsi="Verdana"/>
           <w:bCs/>
         </w:rPr>
-        <w:t>owner</w:t>
-      </w:r>
-      <w:r>
-        <w:rPr>
-          <w:rFonts w:ascii="Verdana" w:hAnsi="Verdana"/>
-          <w:bCs/>
-        </w:rPr>
-        <w:t>.marital_status</w:t>
-      </w:r>
-      <w:proofErr w:type="spellEnd"/>
-      <w:r>
-        <w:rPr>
-          <w:rFonts w:ascii="Verdana" w:hAnsi="Verdana"/>
-          <w:bCs/>
-        </w:rPr>
-        <w:t>}})</w:t>
+        <w:t>.marital_status}})</w:t>
       </w:r>
       <w:r>
         <w:rPr>
@@ -1050,21 +918,7 @@
         <w:rPr>
           <w:rFonts w:ascii="Verdana" w:hAnsi="Verdana"/>
         </w:rPr>
-        <w:t>{{</w:t>
-      </w:r>
-      <w:proofErr w:type="spellStart"/>
-      <w:r>
-        <w:rPr>
-          <w:rFonts w:ascii="Verdana" w:hAnsi="Verdana"/>
-        </w:rPr>
-        <w:t>owner.death_date</w:t>
-      </w:r>
-      <w:proofErr w:type="spellEnd"/>
-      <w:r>
-        <w:rPr>
-          <w:rFonts w:ascii="Verdana" w:hAnsi="Verdana"/>
-        </w:rPr>
-        <w:t>}}</w:t>
+        <w:t>{{owner.death_date}}</w:t>
       </w:r>
       <w:r>
         <w:rPr>
@@ -1076,85 +930,7 @@
         <w:rPr>
           <w:rFonts w:ascii="Verdana" w:hAnsi="Verdana"/>
         </w:rPr>
-        <w:t>{{</w:t>
-      </w:r>
-      <w:proofErr w:type="spellStart"/>
-      <w:r>
-        <w:rPr>
-          <w:rFonts w:ascii="Verdana" w:hAnsi="Verdana"/>
-        </w:rPr>
-        <w:t>end_in_county</w:t>
-      </w:r>
-      <w:proofErr w:type="spellEnd"/>
-      <w:r>
-        <w:rPr>
-          <w:rFonts w:ascii="Verdana" w:hAnsi="Verdana"/>
-        </w:rPr>
-        <w:t>(</w:t>
-      </w:r>
-      <w:proofErr w:type="spellStart"/>
-      <w:r>
-        <w:rPr>
-          <w:rFonts w:ascii="Verdana" w:hAnsi="Verdana"/>
-        </w:rPr>
-        <w:t>owner.</w:t>
-      </w:r>
-      <w:r>
-        <w:rPr>
-          <w:rFonts w:ascii="Verdana" w:hAnsi="Verdana"/>
-        </w:rPr>
-        <w:t>address.</w:t>
-      </w:r>
-      <w:r>
-        <w:rPr>
-          <w:rFonts w:ascii="Verdana" w:hAnsi="Verdana"/>
-        </w:rPr>
-        <w:t>county</w:t>
-      </w:r>
-      <w:proofErr w:type="spellEnd"/>
-      <w:r>
-        <w:rPr>
-          <w:rFonts w:ascii="Verdana" w:hAnsi="Verdana"/>
-        </w:rPr>
-        <w:t>)}}</w:t>
-      </w:r>
-      <w:r>
-        <w:rPr>
-          <w:rFonts w:ascii="Verdana" w:hAnsi="Verdana"/>
-        </w:rPr>
-        <w:t xml:space="preserve"> in the state of </w:t>
-      </w:r>
-      <w:r>
-        <w:rPr>
-          <w:rFonts w:ascii="Verdana" w:hAnsi="Verdana"/>
-        </w:rPr>
-        <w:t>{{</w:t>
-      </w:r>
-      <w:proofErr w:type="spellStart"/>
-      <w:r>
-        <w:rPr>
-          <w:rFonts w:ascii="Verdana" w:hAnsi="Verdana"/>
-        </w:rPr>
-        <w:t>owner.</w:t>
-      </w:r>
-      <w:r>
-        <w:rPr>
-          <w:rFonts w:ascii="Verdana" w:hAnsi="Verdana"/>
-        </w:rPr>
-        <w:t>address.</w:t>
-      </w:r>
-      <w:r>
-        <w:rPr>
-          <w:rFonts w:ascii="Verdana" w:hAnsi="Verdana"/>
-        </w:rPr>
-        <w:t>state</w:t>
-      </w:r>
-      <w:proofErr w:type="spellEnd"/>
-      <w:r>
-        <w:rPr>
-          <w:rFonts w:ascii="Verdana" w:hAnsi="Verdana"/>
-        </w:rPr>
-        <w:t>}}</w:t>
+        <w:t>{{owner_location(owner)}}</w:t>
       </w:r>
       <w:r>
         <w:rPr>
@@ -1162,14 +938,12 @@
         </w:rPr>
         <w:t xml:space="preserve">,{% if </w:t>
       </w:r>
-      <w:proofErr w:type="spellStart"/>
       <w:r>
         <w:rPr>
           <w:rFonts w:ascii="Verdana" w:hAnsi="Verdana"/>
         </w:rPr>
         <w:t>other_owners_check</w:t>
       </w:r>
-      <w:proofErr w:type="spellEnd"/>
       <w:r>
         <w:rPr>
           <w:rFonts w:ascii="Verdana" w:hAnsi="Verdana"/>
@@ -1194,19 +968,11 @@
         </w:rPr>
         <w:t xml:space="preserve">not </w:t>
       </w:r>
-      <w:proofErr w:type="spellStart"/>
-      <w:r>
-        <w:rPr>
-          <w:rFonts w:ascii="Verdana" w:hAnsi="Verdana"/>
-        </w:rPr>
-        <w:t>shared_owners_type</w:t>
-      </w:r>
-      <w:proofErr w:type="spellEnd"/>
-      <w:r>
-        <w:rPr>
-          <w:rFonts w:ascii="Verdana" w:hAnsi="Verdana"/>
-        </w:rPr>
-        <w:t xml:space="preserve"> == "Tenancy in common"</w:t>
+      <w:r>
+        <w:rPr>
+          <w:rFonts w:ascii="Verdana" w:hAnsi="Verdana"/>
+        </w:rPr>
+        <w:t>shared_owners_type == "Tenancy in common"</w:t>
       </w:r>
       <w:r>
         <w:rPr>
@@ -1230,21 +996,7 @@
         <w:rPr>
           <w:rFonts w:ascii="Verdana" w:hAnsi="Verdana"/>
         </w:rPr>
-        <w:t xml:space="preserve">if </w:t>
-      </w:r>
-      <w:proofErr w:type="spellStart"/>
-      <w:r>
-        <w:rPr>
-          <w:rFonts w:ascii="Verdana" w:hAnsi="Verdana"/>
-        </w:rPr>
-        <w:t>other_owners.number_gathered</w:t>
-      </w:r>
-      <w:proofErr w:type="spellEnd"/>
-      <w:r>
-        <w:rPr>
-          <w:rFonts w:ascii="Verdana" w:hAnsi="Verdana"/>
-        </w:rPr>
-        <w:t>() == 1 %}</w:t>
+        <w:t>if other_owners.number_gathered() == 1 %}</w:t>
       </w:r>
       <w:r>
         <w:rPr>
@@ -1280,49 +1032,7 @@
         <w:rPr>
           <w:rFonts w:ascii="Verdana" w:hAnsi="Verdana"/>
         </w:rPr>
-        <w:t>{{</w:t>
-      </w:r>
-      <w:proofErr w:type="spellStart"/>
-      <w:r>
-        <w:rPr>
-          <w:rFonts w:ascii="Verdana" w:hAnsi="Verdana"/>
-        </w:rPr>
-        <w:t>comma_and_list</w:t>
-      </w:r>
-      <w:proofErr w:type="spellEnd"/>
-      <w:r>
-        <w:rPr>
-          <w:rFonts w:ascii="Verdana" w:hAnsi="Verdana"/>
-        </w:rPr>
-        <w:t>(</w:t>
-      </w:r>
-      <w:proofErr w:type="spellStart"/>
-      <w:r>
-        <w:rPr>
-          <w:rFonts w:ascii="Verdana" w:hAnsi="Verdana"/>
-        </w:rPr>
-        <w:t>other_owners_info</w:t>
-      </w:r>
-      <w:proofErr w:type="spellEnd"/>
-      <w:r>
-        <w:rPr>
-          <w:rFonts w:ascii="Verdana" w:hAnsi="Verdana"/>
-        </w:rPr>
-        <w:t>(</w:t>
-      </w:r>
-      <w:proofErr w:type="spellStart"/>
-      <w:r>
-        <w:rPr>
-          <w:rFonts w:ascii="Verdana" w:hAnsi="Verdana"/>
-        </w:rPr>
-        <w:t>other_owners</w:t>
-      </w:r>
-      <w:proofErr w:type="spellEnd"/>
-      <w:r>
-        <w:rPr>
-          <w:rFonts w:ascii="Verdana" w:hAnsi="Verdana"/>
-        </w:rPr>
-        <w:t>))}}</w:t>
+        <w:t>{{comma_and_list(other_owners_info(other_owners))}}</w:t>
       </w:r>
       <w:r>
         <w:rPr>
@@ -1334,21 +1044,7 @@
         <w:rPr>
           <w:rFonts w:ascii="Verdana" w:hAnsi="Verdana"/>
         </w:rPr>
-        <w:t xml:space="preserve">{% endif %} owning{% if </w:t>
-      </w:r>
-      <w:proofErr w:type="spellStart"/>
-      <w:r>
-        <w:rPr>
-          <w:rFonts w:ascii="Verdana" w:hAnsi="Verdana"/>
-        </w:rPr>
-        <w:t>other_owners_check</w:t>
-      </w:r>
-      <w:proofErr w:type="spellEnd"/>
-      <w:r>
-        <w:rPr>
-          <w:rFonts w:ascii="Verdana" w:hAnsi="Verdana"/>
-        </w:rPr>
-        <w:t xml:space="preserve"> != </w:t>
+        <w:t xml:space="preserve">{% endif %} owning{% if other_owners_check != </w:t>
       </w:r>
       <w:r>
         <w:rPr>
@@ -1372,21 +1068,7 @@
         <w:rPr>
           <w:rFonts w:ascii="Verdana" w:hAnsi="Verdana"/>
         </w:rPr>
-        <w:t xml:space="preserve"> %}{% if </w:t>
-      </w:r>
-      <w:proofErr w:type="spellStart"/>
-      <w:r>
-        <w:rPr>
-          <w:rFonts w:ascii="Verdana" w:hAnsi="Verdana"/>
-        </w:rPr>
-        <w:t>shared_owners_type</w:t>
-      </w:r>
-      <w:proofErr w:type="spellEnd"/>
-      <w:r>
-        <w:rPr>
-          <w:rFonts w:ascii="Verdana" w:hAnsi="Verdana"/>
-        </w:rPr>
-        <w:t xml:space="preserve"> == </w:t>
+        <w:t xml:space="preserve"> %}{% if shared_owners_type == </w:t>
       </w:r>
       <w:r>
         <w:rPr>
@@ -1412,7 +1094,6 @@
         </w:rPr>
         <w:t xml:space="preserve"> %} a {{</w:t>
       </w:r>
-      <w:proofErr w:type="spellStart"/>
       <w:r>
         <w:rPr>
           <w:rFonts w:ascii="Verdana" w:hAnsi="Verdana"/>
@@ -1423,14 +1104,7 @@
         <w:rPr>
           <w:rFonts w:ascii="Verdana" w:hAnsi="Verdana"/>
         </w:rPr>
-        <w:t>_common_share</w:t>
-      </w:r>
-      <w:proofErr w:type="spellEnd"/>
-      <w:r>
-        <w:rPr>
-          <w:rFonts w:ascii="Verdana" w:hAnsi="Verdana"/>
-        </w:rPr>
-        <w:t>}}% share of the{% endif %}{% endif %} real estate legally described below:</w:t>
+        <w:t>_common_share}}% share of the{% endif %}{% endif %} real estate legally described below:</w:t>
       </w:r>
     </w:p>
     <w:p>
@@ -1452,33 +1126,17 @@
         </w:rPr>
         <w:t>{{</w:t>
       </w:r>
-      <w:proofErr w:type="spellStart"/>
-      <w:r>
-        <w:rPr>
-          <w:rFonts w:ascii="Verdana" w:hAnsi="Verdana"/>
-        </w:rPr>
-        <w:t>notice_</w:t>
-      </w:r>
-      <w:proofErr w:type="gramStart"/>
-      <w:r>
-        <w:rPr>
-          <w:rFonts w:ascii="Verdana" w:hAnsi="Verdana"/>
-        </w:rPr>
-        <w:t>property.</w:t>
-      </w:r>
-      <w:r>
-        <w:rPr>
-          <w:rFonts w:ascii="Verdana" w:hAnsi="Verdana"/>
-        </w:rPr>
-        <w:t>description</w:t>
-      </w:r>
-      <w:proofErr w:type="spellEnd"/>
-      <w:proofErr w:type="gramEnd"/>
-      <w:r>
-        <w:rPr>
-          <w:rFonts w:ascii="Verdana" w:hAnsi="Verdana"/>
-        </w:rPr>
-        <w:t>}}</w:t>
+      <w:r>
+        <w:rPr>
+          <w:rFonts w:ascii="Verdana" w:hAnsi="Verdana"/>
+        </w:rPr>
+        <w:t>notice_property.</w:t>
+      </w:r>
+      <w:r>
+        <w:rPr>
+          <w:rFonts w:ascii="Verdana" w:hAnsi="Verdana"/>
+        </w:rPr>
+        <w:t>description}}</w:t>
       </w:r>
     </w:p>
     <w:p>
@@ -1500,69 +1158,31 @@
         </w:rPr>
         <w:t>That the street address of the real estate is {{</w:t>
       </w:r>
-      <w:proofErr w:type="spellStart"/>
-      <w:r>
-        <w:rPr>
-          <w:rFonts w:ascii="Verdana" w:hAnsi="Verdana"/>
-        </w:rPr>
-        <w:t>notice_</w:t>
-      </w:r>
-      <w:proofErr w:type="gramStart"/>
-      <w:r>
-        <w:rPr>
-          <w:rFonts w:ascii="Verdana" w:hAnsi="Verdana"/>
-        </w:rPr>
-        <w:t>property.</w:t>
-      </w:r>
-      <w:r>
-        <w:rPr>
-          <w:rFonts w:ascii="Verdana" w:hAnsi="Verdana"/>
-        </w:rPr>
-        <w:t>on</w:t>
-      </w:r>
-      <w:proofErr w:type="gramEnd"/>
-      <w:r>
-        <w:rPr>
-          <w:rFonts w:ascii="Verdana" w:hAnsi="Verdana"/>
-        </w:rPr>
-        <w:t>_one_line</w:t>
-      </w:r>
-      <w:proofErr w:type="spellEnd"/>
-      <w:r>
-        <w:rPr>
-          <w:rFonts w:ascii="Verdana" w:hAnsi="Verdana"/>
-        </w:rPr>
-        <w:t>(</w:t>
+      <w:r>
+        <w:rPr>
+          <w:rFonts w:ascii="Verdana" w:hAnsi="Verdana"/>
+        </w:rPr>
+        <w:t>notice_property.</w:t>
+      </w:r>
+      <w:r>
+        <w:rPr>
+          <w:rFonts w:ascii="Verdana" w:hAnsi="Verdana"/>
+        </w:rPr>
+        <w:t>on_one_line(</w:t>
       </w:r>
       <w:r>
         <w:rPr>
           <w:rFonts w:ascii="Verdana" w:hAnsi="Verdana"/>
           <w:bCs/>
         </w:rPr>
-        <w:t>bare=</w:t>
-      </w:r>
-      <w:proofErr w:type="gramStart"/>
-      <w:r>
-        <w:rPr>
-          <w:rFonts w:ascii="Verdana" w:hAnsi="Verdana"/>
-          <w:bCs/>
-        </w:rPr>
-        <w:t>True</w:t>
-      </w:r>
-      <w:r>
-        <w:rPr>
-          <w:rFonts w:ascii="Verdana" w:hAnsi="Verdana"/>
-        </w:rPr>
-        <w:t>)}}</w:t>
-      </w:r>
-      <w:proofErr w:type="gramEnd"/>
-      <w:r>
-        <w:rPr>
-          <w:rFonts w:ascii="Verdana" w:hAnsi="Verdana"/>
-        </w:rPr>
-        <w:t xml:space="preserve"> and the property index number is {{</w:t>
-      </w:r>
-      <w:proofErr w:type="spellStart"/>
+        <w:t>bare=True</w:t>
+      </w:r>
+      <w:r>
+        <w:rPr>
+          <w:rFonts w:ascii="Verdana" w:hAnsi="Verdana"/>
+        </w:rPr>
+        <w:t>)}} and the property index number is {{</w:t>
+      </w:r>
       <w:r>
         <w:rPr>
           <w:rFonts w:ascii="Verdana" w:hAnsi="Verdana"/>
@@ -1573,14 +1193,7 @@
         <w:rPr>
           <w:rFonts w:ascii="Verdana" w:hAnsi="Verdana"/>
         </w:rPr>
-        <w:t>pin</w:t>
-      </w:r>
-      <w:proofErr w:type="spellEnd"/>
-      <w:r>
-        <w:rPr>
-          <w:rFonts w:ascii="Verdana" w:hAnsi="Verdana"/>
-        </w:rPr>
-        <w:t>}}.</w:t>
+        <w:t>pin}}.</w:t>
       </w:r>
     </w:p>
     <w:p>
@@ -1602,33 +1215,17 @@
         </w:rPr>
         <w:t>That the Transfer on Death Instrument is dated {{</w:t>
       </w:r>
-      <w:proofErr w:type="spellStart"/>
       <w:r>
         <w:rPr>
           <w:rFonts w:ascii="Verdana" w:hAnsi="Verdana"/>
         </w:rPr>
         <w:t>todi_date</w:t>
       </w:r>
-      <w:proofErr w:type="spellEnd"/>
-      <w:r>
-        <w:rPr>
-          <w:rFonts w:ascii="Verdana" w:hAnsi="Verdana"/>
-        </w:rPr>
-        <w:t>}} and recorded as Document No. {{</w:t>
-      </w:r>
-      <w:proofErr w:type="spellStart"/>
-      <w:r>
-        <w:rPr>
-          <w:rFonts w:ascii="Verdana" w:hAnsi="Verdana"/>
-        </w:rPr>
-        <w:t>document_number</w:t>
-      </w:r>
-      <w:proofErr w:type="spellEnd"/>
-      <w:r>
-        <w:rPr>
-          <w:rFonts w:ascii="Verdana" w:hAnsi="Verdana"/>
-        </w:rPr>
-        <w:t>}} in the Office of the Recorder for {</w:t>
+      <w:r>
+        <w:rPr>
+          <w:rFonts w:ascii="Verdana" w:hAnsi="Verdana"/>
+        </w:rPr>
+        <w:t>}} and recorded as Document No. {{document_number}} in the Office of the Recorder for {</w:t>
       </w:r>
       <w:r>
         <w:rPr>
@@ -1636,47 +1233,23 @@
         </w:rPr>
         <w:t>{</w:t>
       </w:r>
-      <w:proofErr w:type="spellStart"/>
-      <w:r>
-        <w:rPr>
-          <w:rFonts w:ascii="Verdana" w:hAnsi="Verdana"/>
-        </w:rPr>
-        <w:t>end_in_county</w:t>
-      </w:r>
-      <w:proofErr w:type="spellEnd"/>
-      <w:r>
-        <w:rPr>
-          <w:rFonts w:ascii="Verdana" w:hAnsi="Verdana"/>
-        </w:rPr>
-        <w:t>(</w:t>
-      </w:r>
-      <w:proofErr w:type="spellStart"/>
-      <w:r>
-        <w:rPr>
-          <w:rFonts w:ascii="Verdana" w:hAnsi="Verdana"/>
-        </w:rPr>
-        <w:t>notice_</w:t>
-      </w:r>
-      <w:proofErr w:type="gramStart"/>
-      <w:r>
-        <w:rPr>
-          <w:rFonts w:ascii="Verdana" w:hAnsi="Verdana"/>
-        </w:rPr>
-        <w:t>property.</w:t>
-      </w:r>
-      <w:r>
-        <w:rPr>
-          <w:rFonts w:ascii="Verdana" w:hAnsi="Verdana"/>
-        </w:rPr>
-        <w:t>county</w:t>
-      </w:r>
-      <w:proofErr w:type="spellEnd"/>
-      <w:proofErr w:type="gramEnd"/>
-      <w:r>
-        <w:rPr>
-          <w:rFonts w:ascii="Verdana" w:hAnsi="Verdana"/>
-        </w:rPr>
-        <w:t>)}}, Illinois.</w:t>
+      <w:r>
+        <w:rPr>
+          <w:rFonts w:ascii="Verdana" w:hAnsi="Verdana"/>
+        </w:rPr>
+        <w:t>end_in_county(</w:t>
+      </w:r>
+      <w:r>
+        <w:rPr>
+          <w:rFonts w:ascii="Verdana" w:hAnsi="Verdana"/>
+        </w:rPr>
+        <w:t>notice_property.</w:t>
+      </w:r>
+      <w:r>
+        <w:rPr>
+          <w:rFonts w:ascii="Verdana" w:hAnsi="Verdana"/>
+        </w:rPr>
+        <w:t>county)}}, Illinois.</w:t>
       </w:r>
     </w:p>
     <w:p>
@@ -1744,25 +1317,7 @@
                 <w:b/>
                 <w:spacing w:val="-4"/>
               </w:rPr>
-              <w:t xml:space="preserve">Beneficiary </w:t>
-            </w:r>
-            <w:proofErr w:type="gramStart"/>
-            <w:r>
-              <w:rPr>
-                <w:rFonts w:ascii="Verdana" w:hAnsi="Verdana"/>
-                <w:b/>
-                <w:spacing w:val="-4"/>
-              </w:rPr>
-              <w:t>Name,  Relationship</w:t>
-            </w:r>
-            <w:proofErr w:type="gramEnd"/>
-            <w:r>
-              <w:rPr>
-                <w:rFonts w:ascii="Verdana" w:hAnsi="Verdana"/>
-                <w:b/>
-                <w:spacing w:val="-4"/>
-              </w:rPr>
-              <w:t xml:space="preserve"> to Owner</w:t>
+              <w:t>Beneficiary Name,  Relationship to Owner</w:t>
             </w:r>
           </w:p>
         </w:tc>
@@ -1826,19 +1381,11 @@
         </w:rPr>
         <w:t xml:space="preserve">{% for person in </w:t>
       </w:r>
-      <w:proofErr w:type="spellStart"/>
-      <w:r>
-        <w:rPr>
-          <w:rFonts w:ascii="Verdana" w:hAnsi="Verdana"/>
-        </w:rPr>
-        <w:t>include_needed</w:t>
-      </w:r>
-      <w:proofErr w:type="spellEnd"/>
-      <w:r>
-        <w:rPr>
-          <w:rFonts w:ascii="Verdana" w:hAnsi="Verdana"/>
-        </w:rPr>
-        <w:t>(</w:t>
+      <w:r>
+        <w:rPr>
+          <w:rFonts w:ascii="Verdana" w:hAnsi="Verdana"/>
+        </w:rPr>
+        <w:t>include_needed(</w:t>
       </w:r>
       <w:r>
         <w:rPr>
@@ -1846,7 +1393,6 @@
         </w:rPr>
         <w:t>users</w:t>
       </w:r>
-      <w:proofErr w:type="gramStart"/>
       <w:r>
         <w:rPr>
           <w:rFonts w:ascii="Verdana" w:hAnsi="Verdana"/>
@@ -1859,7 +1405,6 @@
         </w:rPr>
         <w:t xml:space="preserve"> %}</w:t>
       </w:r>
-      <w:proofErr w:type="gramEnd"/>
     </w:p>
     <w:tbl>
       <w:tblPr>
@@ -1908,9 +1453,8 @@
                 <w:sz w:val="24"/>
                 <w:szCs w:val="24"/>
               </w:rPr>
-              <w:t>{{</w:t>
+              <w:t>{{person.name_full()}}</w:t>
             </w:r>
-            <w:proofErr w:type="spellStart"/>
             <w:r>
               <w:rPr>
                 <w:rFonts w:ascii="Verdana" w:hAnsi="Verdana"/>
@@ -1920,78 +1464,7 @@
                 <w:sz w:val="24"/>
                 <w:szCs w:val="24"/>
               </w:rPr>
-              <w:t>person.name_</w:t>
-            </w:r>
-            <w:proofErr w:type="gramStart"/>
-            <w:r>
-              <w:rPr>
-                <w:rFonts w:ascii="Verdana" w:hAnsi="Verdana"/>
-                <w:b w:val="0"/>
-                <w:bCs w:val="0"/>
-                <w:color w:val="000000" w:themeColor="text1"/>
-                <w:sz w:val="24"/>
-                <w:szCs w:val="24"/>
-              </w:rPr>
-              <w:t>full</w:t>
-            </w:r>
-            <w:proofErr w:type="spellEnd"/>
-            <w:r>
-              <w:rPr>
-                <w:rFonts w:ascii="Verdana" w:hAnsi="Verdana"/>
-                <w:b w:val="0"/>
-                <w:bCs w:val="0"/>
-                <w:color w:val="000000" w:themeColor="text1"/>
-                <w:sz w:val="24"/>
-                <w:szCs w:val="24"/>
-              </w:rPr>
-              <w:t>(</w:t>
-            </w:r>
-            <w:proofErr w:type="gramEnd"/>
-            <w:r>
-              <w:rPr>
-                <w:rFonts w:ascii="Verdana" w:hAnsi="Verdana"/>
-                <w:b w:val="0"/>
-                <w:bCs w:val="0"/>
-                <w:color w:val="000000" w:themeColor="text1"/>
-                <w:sz w:val="24"/>
-                <w:szCs w:val="24"/>
-              </w:rPr>
-              <w:t>)}}</w:t>
-            </w:r>
-            <w:r>
-              <w:rPr>
-                <w:rFonts w:ascii="Verdana" w:hAnsi="Verdana"/>
-                <w:b w:val="0"/>
-                <w:bCs w:val="0"/>
-                <w:color w:val="000000" w:themeColor="text1"/>
-                <w:sz w:val="24"/>
-                <w:szCs w:val="24"/>
-              </w:rPr>
-              <w:t>, {{</w:t>
-            </w:r>
-            <w:proofErr w:type="spellStart"/>
-            <w:r>
-              <w:rPr>
-                <w:rFonts w:ascii="Verdana" w:hAnsi="Verdana"/>
-                <w:b w:val="0"/>
-                <w:bCs w:val="0"/>
-                <w:color w:val="000000" w:themeColor="text1"/>
-                <w:sz w:val="24"/>
-                <w:szCs w:val="24"/>
-              </w:rPr>
-              <w:t>get_relationship</w:t>
-            </w:r>
-            <w:proofErr w:type="spellEnd"/>
-            <w:r>
-              <w:rPr>
-                <w:rFonts w:ascii="Verdana" w:hAnsi="Verdana"/>
-                <w:b w:val="0"/>
-                <w:bCs w:val="0"/>
-                <w:color w:val="000000" w:themeColor="text1"/>
-                <w:sz w:val="24"/>
-                <w:szCs w:val="24"/>
-              </w:rPr>
-              <w:t>(person)}}</w:t>
+              <w:t>, {{get_relationship(person)}}</w:t>
             </w:r>
           </w:p>
         </w:tc>
@@ -2018,11 +1491,16 @@
                 <w:sz w:val="24"/>
                 <w:szCs w:val="24"/>
               </w:rPr>
-              <w:t>{{</w:t>
+              <w:t>{{person.address.on_one_line(bare=True)}}</w:t>
             </w:r>
-            <w:proofErr w:type="spellStart"/>
-            <w:proofErr w:type="gramStart"/>
-            <w:r>
+          </w:p>
+        </w:tc>
+        <w:tc>
+          <w:tcPr>
+            <w:tcW w:w="1280" w:type="dxa"/>
+          </w:tcPr>
+          <w:p>
+            <w:pPr>
               <w:rPr>
                 <w:rFonts w:ascii="Verdana" w:hAnsi="Verdana"/>
                 <w:b w:val="0"/>
@@ -2030,9 +1508,7 @@
                 <w:sz w:val="24"/>
                 <w:szCs w:val="24"/>
               </w:rPr>
-              <w:t>person.address</w:t>
-            </w:r>
-            <w:proofErr w:type="gramEnd"/>
+            </w:pPr>
             <w:r>
               <w:rPr>
                 <w:rFonts w:ascii="Verdana" w:hAnsi="Verdana"/>
@@ -2041,9 +1517,8 @@
                 <w:sz w:val="24"/>
                 <w:szCs w:val="24"/>
               </w:rPr>
-              <w:t>.on_one_line</w:t>
+              <w:t>{% if percentage_short_enoug</w:t>
             </w:r>
-            <w:proofErr w:type="spellEnd"/>
             <w:r>
               <w:rPr>
                 <w:rFonts w:ascii="Verdana" w:hAnsi="Verdana"/>
@@ -2052,16 +1527,10 @@
                 <w:sz w:val="24"/>
                 <w:szCs w:val="24"/>
               </w:rPr>
-              <w:t>(bare=True)}}</w:t>
+              <w:lastRenderedPageBreak/>
+              <w:t>h(person.percent_share) == False %}1/{{</w:t>
             </w:r>
-          </w:p>
-        </w:tc>
-        <w:tc>
-          <w:tcPr>
-            <w:tcW w:w="1280" w:type="dxa"/>
-          </w:tcPr>
-          <w:p>
-            <w:pPr>
+            <w:r>
               <w:rPr>
                 <w:rFonts w:ascii="Verdana" w:hAnsi="Verdana"/>
                 <w:b w:val="0"/>
@@ -2069,7 +1538,8 @@
                 <w:sz w:val="24"/>
                 <w:szCs w:val="24"/>
               </w:rPr>
-            </w:pPr>
+              <w:t>users</w:t>
+            </w:r>
             <w:r>
               <w:rPr>
                 <w:rFonts w:ascii="Verdana" w:hAnsi="Verdana"/>
@@ -2078,230 +1548,7 @@
                 <w:sz w:val="24"/>
                 <w:szCs w:val="24"/>
               </w:rPr>
-              <w:t xml:space="preserve">{% if </w:t>
-            </w:r>
-            <w:proofErr w:type="spellStart"/>
-            <w:r>
-              <w:rPr>
-                <w:rFonts w:ascii="Verdana" w:hAnsi="Verdana"/>
-                <w:b w:val="0"/>
-                <w:bCs w:val="0"/>
-                <w:sz w:val="24"/>
-                <w:szCs w:val="24"/>
-              </w:rPr>
-              <w:t>percentage_shor</w:t>
-            </w:r>
-            <w:r>
-              <w:rPr>
-                <w:rFonts w:ascii="Verdana" w:hAnsi="Verdana"/>
-                <w:b w:val="0"/>
-                <w:bCs w:val="0"/>
-                <w:sz w:val="24"/>
-                <w:szCs w:val="24"/>
-              </w:rPr>
-              <w:lastRenderedPageBreak/>
-              <w:t>t_enough</w:t>
-            </w:r>
-            <w:proofErr w:type="spellEnd"/>
-            <w:r>
-              <w:rPr>
-                <w:rFonts w:ascii="Verdana" w:hAnsi="Verdana"/>
-                <w:b w:val="0"/>
-                <w:bCs w:val="0"/>
-                <w:sz w:val="24"/>
-                <w:szCs w:val="24"/>
-              </w:rPr>
-              <w:t>(</w:t>
-            </w:r>
-            <w:proofErr w:type="spellStart"/>
-            <w:proofErr w:type="gramStart"/>
-            <w:r>
-              <w:rPr>
-                <w:rFonts w:ascii="Verdana" w:hAnsi="Verdana"/>
-                <w:b w:val="0"/>
-                <w:bCs w:val="0"/>
-                <w:sz w:val="24"/>
-                <w:szCs w:val="24"/>
-              </w:rPr>
-              <w:t>person.percent</w:t>
-            </w:r>
-            <w:proofErr w:type="gramEnd"/>
-            <w:r>
-              <w:rPr>
-                <w:rFonts w:ascii="Verdana" w:hAnsi="Verdana"/>
-                <w:b w:val="0"/>
-                <w:bCs w:val="0"/>
-                <w:sz w:val="24"/>
-                <w:szCs w:val="24"/>
-              </w:rPr>
-              <w:t>_share</w:t>
-            </w:r>
-            <w:proofErr w:type="spellEnd"/>
-            <w:r>
-              <w:rPr>
-                <w:rFonts w:ascii="Verdana" w:hAnsi="Verdana"/>
-                <w:b w:val="0"/>
-                <w:bCs w:val="0"/>
-                <w:sz w:val="24"/>
-                <w:szCs w:val="24"/>
-              </w:rPr>
-              <w:t>) == False %}1/{{</w:t>
-            </w:r>
-            <w:proofErr w:type="spellStart"/>
-            <w:proofErr w:type="gramStart"/>
-            <w:r>
-              <w:rPr>
-                <w:rFonts w:ascii="Verdana" w:hAnsi="Verdana"/>
-                <w:b w:val="0"/>
-                <w:bCs w:val="0"/>
-                <w:sz w:val="24"/>
-                <w:szCs w:val="24"/>
-              </w:rPr>
-              <w:t>users</w:t>
-            </w:r>
-            <w:r>
-              <w:rPr>
-                <w:rFonts w:ascii="Verdana" w:hAnsi="Verdana"/>
-                <w:b w:val="0"/>
-                <w:bCs w:val="0"/>
-                <w:sz w:val="24"/>
-                <w:szCs w:val="24"/>
-              </w:rPr>
-              <w:t>.number</w:t>
-            </w:r>
-            <w:proofErr w:type="gramEnd"/>
-            <w:r>
-              <w:rPr>
-                <w:rFonts w:ascii="Verdana" w:hAnsi="Verdana"/>
-                <w:b w:val="0"/>
-                <w:bCs w:val="0"/>
-                <w:sz w:val="24"/>
-                <w:szCs w:val="24"/>
-              </w:rPr>
-              <w:t>_</w:t>
-            </w:r>
-            <w:proofErr w:type="gramStart"/>
-            <w:r>
-              <w:rPr>
-                <w:rFonts w:ascii="Verdana" w:hAnsi="Verdana"/>
-                <w:b w:val="0"/>
-                <w:bCs w:val="0"/>
-                <w:sz w:val="24"/>
-                <w:szCs w:val="24"/>
-              </w:rPr>
-              <w:t>gathered</w:t>
-            </w:r>
-            <w:proofErr w:type="spellEnd"/>
-            <w:r>
-              <w:rPr>
-                <w:rFonts w:ascii="Verdana" w:hAnsi="Verdana"/>
-                <w:b w:val="0"/>
-                <w:bCs w:val="0"/>
-                <w:sz w:val="24"/>
-                <w:szCs w:val="24"/>
-              </w:rPr>
-              <w:t>(</w:t>
-            </w:r>
-            <w:proofErr w:type="gramEnd"/>
-            <w:r>
-              <w:rPr>
-                <w:rFonts w:ascii="Verdana" w:hAnsi="Verdana"/>
-                <w:b w:val="0"/>
-                <w:bCs w:val="0"/>
-                <w:sz w:val="24"/>
-                <w:szCs w:val="24"/>
-              </w:rPr>
-              <w:t>)</w:t>
-            </w:r>
-            <w:proofErr w:type="gramStart"/>
-            <w:r>
-              <w:rPr>
-                <w:rFonts w:ascii="Verdana" w:hAnsi="Verdana"/>
-                <w:b w:val="0"/>
-                <w:bCs w:val="0"/>
-                <w:sz w:val="24"/>
-                <w:szCs w:val="24"/>
-              </w:rPr>
-              <w:t>}}{</w:t>
-            </w:r>
-            <w:proofErr w:type="gramEnd"/>
-            <w:r>
-              <w:rPr>
-                <w:rFonts w:ascii="Verdana" w:hAnsi="Verdana"/>
-                <w:b w:val="0"/>
-                <w:bCs w:val="0"/>
-                <w:sz w:val="24"/>
-                <w:szCs w:val="24"/>
-              </w:rPr>
-              <w:t xml:space="preserve">% else </w:t>
-            </w:r>
-            <w:proofErr w:type="gramStart"/>
-            <w:r>
-              <w:rPr>
-                <w:rFonts w:ascii="Verdana" w:hAnsi="Verdana"/>
-                <w:b w:val="0"/>
-                <w:bCs w:val="0"/>
-                <w:sz w:val="24"/>
-                <w:szCs w:val="24"/>
-              </w:rPr>
-              <w:t>%}{</w:t>
-            </w:r>
-            <w:proofErr w:type="gramEnd"/>
-            <w:r>
-              <w:rPr>
-                <w:rFonts w:ascii="Verdana" w:hAnsi="Verdana"/>
-                <w:b w:val="0"/>
-                <w:bCs w:val="0"/>
-                <w:sz w:val="24"/>
-                <w:szCs w:val="24"/>
-              </w:rPr>
-              <w:t>{</w:t>
-            </w:r>
-            <w:proofErr w:type="spellStart"/>
-            <w:proofErr w:type="gramStart"/>
-            <w:r>
-              <w:rPr>
-                <w:rFonts w:ascii="Verdana" w:hAnsi="Verdana"/>
-                <w:b w:val="0"/>
-                <w:bCs w:val="0"/>
-                <w:sz w:val="24"/>
-                <w:szCs w:val="24"/>
-              </w:rPr>
-              <w:t>person.percent</w:t>
-            </w:r>
-            <w:proofErr w:type="gramEnd"/>
-            <w:r>
-              <w:rPr>
-                <w:rFonts w:ascii="Verdana" w:hAnsi="Verdana"/>
-                <w:b w:val="0"/>
-                <w:bCs w:val="0"/>
-                <w:sz w:val="24"/>
-                <w:szCs w:val="24"/>
-              </w:rPr>
-              <w:t>_share</w:t>
-            </w:r>
-            <w:proofErr w:type="spellEnd"/>
-            <w:proofErr w:type="gramStart"/>
-            <w:r>
-              <w:rPr>
-                <w:rFonts w:ascii="Verdana" w:hAnsi="Verdana"/>
-                <w:b w:val="0"/>
-                <w:bCs w:val="0"/>
-                <w:sz w:val="24"/>
-                <w:szCs w:val="24"/>
-              </w:rPr>
-              <w:t>}}%</w:t>
-            </w:r>
-            <w:proofErr w:type="gramEnd"/>
-            <w:r>
-              <w:rPr>
-                <w:rFonts w:ascii="Verdana" w:hAnsi="Verdana"/>
-                <w:b w:val="0"/>
-                <w:bCs w:val="0"/>
-                <w:sz w:val="24"/>
-                <w:szCs w:val="24"/>
-              </w:rPr>
-              <w:t>{% endif %}</w:t>
+              <w:t>.number_gathered()}}{% else %}{{person.percent_share}}%{% endif %}</w:t>
             </w:r>
           </w:p>
           <w:p>
@@ -2331,21 +1578,7 @@
           <w:rFonts w:ascii="Verdana" w:hAnsi="Verdana"/>
         </w:rPr>
         <w:lastRenderedPageBreak/>
-        <w:t xml:space="preserve">{% </w:t>
-      </w:r>
-      <w:proofErr w:type="spellStart"/>
-      <w:r>
-        <w:rPr>
-          <w:rFonts w:ascii="Verdana" w:hAnsi="Verdana"/>
-        </w:rPr>
-        <w:t>endfor</w:t>
-      </w:r>
-      <w:proofErr w:type="spellEnd"/>
-      <w:r>
-        <w:rPr>
-          <w:rFonts w:ascii="Verdana" w:hAnsi="Verdana"/>
-        </w:rPr>
-        <w:t xml:space="preserve"> %}</w:t>
+        <w:t>{% endfor %}</w:t>
       </w:r>
     </w:p>
     <w:p>
@@ -2368,21 +1601,7 @@
         <w:rPr>
           <w:rFonts w:ascii="Verdana" w:hAnsi="Verdana"/>
         </w:rPr>
-        <w:t>In witness whereof, the undersigned beneficiaries hereby accept the transfer of real estate under the transfer on death instrument this _______ day of ___________, _____</w:t>
-      </w:r>
-      <w:proofErr w:type="gramStart"/>
-      <w:r>
-        <w:rPr>
-          <w:rFonts w:ascii="Verdana" w:hAnsi="Verdana"/>
-        </w:rPr>
-        <w:t>_.{</w:t>
-      </w:r>
-      <w:proofErr w:type="gramEnd"/>
-      <w:r>
-        <w:rPr>
-          <w:rFonts w:ascii="Verdana" w:hAnsi="Verdana"/>
-        </w:rPr>
-        <w:t xml:space="preserve">% for person in </w:t>
+        <w:t xml:space="preserve">In witness whereof, the undersigned beneficiaries hereby accept the transfer of real estate under the transfer on death instrument this _______ day of ___________, ______.{% for person in </w:t>
       </w:r>
       <w:r>
         <w:rPr>
@@ -2394,35 +1613,7 @@
         <w:rPr>
           <w:rFonts w:ascii="Verdana" w:hAnsi="Verdana"/>
         </w:rPr>
-        <w:t xml:space="preserve"> </w:t>
-      </w:r>
-      <w:proofErr w:type="gramStart"/>
-      <w:r>
-        <w:rPr>
-          <w:rFonts w:ascii="Verdana" w:hAnsi="Verdana"/>
-        </w:rPr>
-        <w:t>%}{</w:t>
-      </w:r>
-      <w:proofErr w:type="gramEnd"/>
-      <w:r>
-        <w:rPr>
-          <w:rFonts w:ascii="Verdana" w:hAnsi="Verdana"/>
-        </w:rPr>
-        <w:t>% if (</w:t>
-      </w:r>
-      <w:proofErr w:type="gramStart"/>
-      <w:r>
-        <w:rPr>
-          <w:rFonts w:ascii="Verdana" w:hAnsi="Verdana"/>
-        </w:rPr>
-        <w:t>loop.index</w:t>
-      </w:r>
-      <w:proofErr w:type="gramEnd"/>
-      <w:r>
-        <w:rPr>
-          <w:rFonts w:ascii="Verdana" w:hAnsi="Verdana"/>
-        </w:rPr>
-        <w:t>0 % 2) == 0 %}</w:t>
+        <w:t xml:space="preserve"> %}{% if (loop.index0 % 2) == 0 %}</w:t>
       </w:r>
     </w:p>
     <w:p>
@@ -2691,38 +1882,8 @@
         <w:rPr>
           <w:rFonts w:ascii="Verdana" w:hAnsi="Verdana"/>
         </w:rPr>
-        <w:t xml:space="preserve">{% endif </w:t>
-      </w:r>
-      <w:proofErr w:type="gramStart"/>
-      <w:r>
-        <w:rPr>
-          <w:rFonts w:ascii="Verdana" w:hAnsi="Verdana"/>
-        </w:rPr>
-        <w:t>%}{</w:t>
-      </w:r>
-      <w:proofErr w:type="gramEnd"/>
-      <w:r>
-        <w:rPr>
-          <w:rFonts w:ascii="Verdana" w:hAnsi="Verdana"/>
-        </w:rPr>
-        <w:t xml:space="preserve">% </w:t>
-      </w:r>
-      <w:proofErr w:type="spellStart"/>
-      <w:proofErr w:type="gramStart"/>
-      <w:r>
-        <w:rPr>
-          <w:rFonts w:ascii="Verdana" w:hAnsi="Verdana"/>
-        </w:rPr>
-        <w:t>endfor</w:t>
-      </w:r>
-      <w:proofErr w:type="spellEnd"/>
-      <w:r>
-        <w:rPr>
-          <w:rFonts w:ascii="Verdana" w:hAnsi="Verdana"/>
-        </w:rPr>
-        <w:t xml:space="preserve"> %}</w:t>
-      </w:r>
-      <w:proofErr w:type="gramEnd"/>
+        <w:t>{% endif %}{% endfor %}</w:t>
+      </w:r>
     </w:p>
     <w:p>
       <w:pPr>
@@ -2796,28 +1957,13 @@
           <w:rFonts w:ascii="Verdana" w:hAnsi="Verdana"/>
           <w:bCs/>
         </w:rPr>
-        <w:t>___________________________________</w:t>
-      </w:r>
-      <w:proofErr w:type="gramStart"/>
-      <w:r>
-        <w:rPr>
-          <w:rFonts w:ascii="Verdana" w:hAnsi="Verdana"/>
-          <w:bCs/>
-        </w:rPr>
-        <w:t>_</w:t>
-      </w:r>
-      <w:r>
-        <w:rPr>
-          <w:rFonts w:ascii="Verdana" w:hAnsi="Verdana"/>
-        </w:rPr>
-        <w:t xml:space="preserve">  personally</w:t>
-      </w:r>
-      <w:proofErr w:type="gramEnd"/>
-      <w:r>
-        <w:rPr>
-          <w:rFonts w:ascii="Verdana" w:hAnsi="Verdana"/>
-        </w:rPr>
-        <w:t xml:space="preserve"> known to me to be the same person or persons whose name or names are subscribed to the foregoing instrument, appeared before me this day in person and swore on oath to the above foregoing affidavit. Signed and sworn to before me this ____ day of _________________, _______.</w:t>
+        <w:t>____________________________________</w:t>
+      </w:r>
+      <w:r>
+        <w:rPr>
+          <w:rFonts w:ascii="Verdana" w:hAnsi="Verdana"/>
+        </w:rPr>
+        <w:t xml:space="preserve">  personally known to me to be the same person or persons whose name or names are subscribed to the foregoing instrument, appeared before me this day in person and swore on oath to the above foregoing affidavit. Signed and sworn to before me this ____ day of _________________, _______.</w:t>
       </w:r>
     </w:p>
     <w:p>

</xml_diff>